<commit_message>
feat: working with slugs
</commit_message>
<xml_diff>
--- a/django2/info-django2.docx
+++ b/django2/info-django2.docx
@@ -38,8 +38,9 @@
         <w:rPr>
           <w:b w:val="0"/>
           <w:bCs w:val="0"/>
-          <w:sz w:val="72"/>
-          <w:szCs w:val="72"/>
+          <w:sz w:val="40"/>
+          <w:szCs w:val="40"/>
+          <w:highlight w:val="none"/>
         </w:rPr>
       </w:r>
       <w:r>
@@ -208,6 +209,14 @@
           <w:szCs w:val="48"/>
         </w:rPr>
       </w:r>
+      <w:r>
+        <w:rPr>
+          <w:b w:val="0"/>
+          <w:bCs w:val="0"/>
+          <w:sz w:val="48"/>
+          <w:szCs w:val="48"/>
+        </w:rPr>
+      </w:r>
     </w:p>
     <w:p>
       <w:pPr>
@@ -244,9 +253,8 @@
         <w:rPr>
           <w:b w:val="0"/>
           <w:bCs w:val="0"/>
-          <w:sz w:val="28"/>
-          <w:szCs w:val="28"/>
-          <w:highlight w:val="none"/>
+          <w:sz w:val="48"/>
+          <w:szCs w:val="48"/>
         </w:rPr>
       </w:r>
     </w:p>
@@ -311,9 +319,8 @@
         <w:rPr>
           <w:b w:val="0"/>
           <w:bCs w:val="0"/>
-          <w:sz w:val="28"/>
-          <w:szCs w:val="28"/>
-          <w:highlight w:val="none"/>
+          <w:sz w:val="48"/>
+          <w:szCs w:val="48"/>
         </w:rPr>
       </w:r>
     </w:p>
@@ -352,9 +359,8 @@
         <w:rPr>
           <w:b w:val="0"/>
           <w:bCs w:val="0"/>
-          <w:sz w:val="28"/>
-          <w:szCs w:val="28"/>
-          <w:highlight w:val="none"/>
+          <w:sz w:val="48"/>
+          <w:szCs w:val="48"/>
         </w:rPr>
       </w:r>
     </w:p>
@@ -463,6 +469,14 @@
           <w:szCs w:val="48"/>
         </w:rPr>
       </w:r>
+      <w:r>
+        <w:rPr>
+          <w:b/>
+          <w:bCs/>
+          <w:sz w:val="48"/>
+          <w:szCs w:val="48"/>
+        </w:rPr>
+      </w:r>
     </w:p>
     <w:p>
       <w:pPr>
@@ -497,11 +511,10 @@
       </w:r>
       <w:r>
         <w:rPr>
-          <w:b w:val="0"/>
-          <w:bCs w:val="0"/>
-          <w:sz w:val="28"/>
-          <w:szCs w:val="28"/>
-          <w:highlight w:val="none"/>
+          <w:b/>
+          <w:bCs/>
+          <w:sz w:val="48"/>
+          <w:szCs w:val="48"/>
         </w:rPr>
       </w:r>
     </w:p>
@@ -560,6 +573,14 @@
           <w:szCs w:val="48"/>
         </w:rPr>
       </w:r>
+      <w:r>
+        <w:rPr>
+          <w:b w:val="0"/>
+          <w:bCs w:val="0"/>
+          <w:sz w:val="48"/>
+          <w:szCs w:val="48"/>
+        </w:rPr>
+      </w:r>
     </w:p>
     <w:p>
       <w:pPr>
@@ -598,6 +619,14 @@
           <w:highlight w:val="none"/>
         </w:rPr>
         <w:t xml:space="preserve">é do tipo ‘submit’ quando ele submete dados;</w:t>
+      </w:r>
+      <w:r>
+        <w:rPr>
+          <w:b w:val="0"/>
+          <w:bCs w:val="0"/>
+          <w:sz w:val="48"/>
+          <w:szCs w:val="48"/>
+        </w:rPr>
       </w:r>
       <w:r>
         <w:rPr>
@@ -669,9 +698,8 @@
         <w:rPr>
           <w:b w:val="0"/>
           <w:bCs w:val="0"/>
-          <w:sz w:val="28"/>
-          <w:szCs w:val="28"/>
-          <w:highlight w:val="none"/>
+          <w:sz w:val="48"/>
+          <w:szCs w:val="48"/>
         </w:rPr>
       </w:r>
       <w:r>
@@ -756,9 +784,8 @@
         <w:rPr>
           <w:b w:val="0"/>
           <w:bCs w:val="0"/>
-          <w:sz w:val="28"/>
-          <w:szCs w:val="28"/>
-          <w:highlight w:val="none"/>
+          <w:sz w:val="48"/>
+          <w:szCs w:val="48"/>
         </w:rPr>
       </w:r>
     </w:p>
@@ -808,6 +835,14 @@
           <w:szCs w:val="48"/>
         </w:rPr>
       </w:r>
+      <w:r>
+        <w:rPr>
+          <w:b w:val="0"/>
+          <w:bCs w:val="0"/>
+          <w:sz w:val="48"/>
+          <w:szCs w:val="48"/>
+        </w:rPr>
+      </w:r>
     </w:p>
     <w:p>
       <w:pPr>
@@ -855,6 +890,14 @@
           <w:highlight w:val="none"/>
         </w:rPr>
         <w:t xml:space="preserve">étodo is_valid();</w:t>
+      </w:r>
+      <w:r>
+        <w:rPr>
+          <w:b w:val="0"/>
+          <w:bCs w:val="0"/>
+          <w:sz w:val="48"/>
+          <w:szCs w:val="48"/>
+        </w:rPr>
       </w:r>
       <w:r>
         <w:rPr>
@@ -966,6 +1009,333 @@
         <w:rPr>
           <w:b w:val="0"/>
           <w:bCs w:val="0"/>
+          <w:sz w:val="48"/>
+          <w:szCs w:val="48"/>
+        </w:rPr>
+      </w:r>
+    </w:p>
+    <w:p>
+      <w:pPr>
+        <w:pBdr/>
+        <w:spacing/>
+        <w:ind w:firstLine="0" w:left="709"/>
+        <w:jc w:val="both"/>
+        <w:rPr>
+          <w:b w:val="0"/>
+          <w:bCs w:val="0"/>
+          <w:sz w:val="48"/>
+          <w:szCs w:val="48"/>
+        </w:rPr>
+      </w:pPr>
+      <w:r>
+        <w:rPr>
+          <w:b w:val="0"/>
+          <w:bCs w:val="0"/>
+          <w:sz w:val="28"/>
+          <w:szCs w:val="28"/>
+          <w:highlight w:val="none"/>
+        </w:rPr>
+      </w:r>
+      <w:r>
+        <w:rPr>
+          <w:b w:val="0"/>
+          <w:bCs w:val="0"/>
+          <w:sz w:val="28"/>
+          <w:szCs w:val="28"/>
+          <w:highlight w:val="none"/>
+        </w:rPr>
+      </w:r>
+      <w:r>
+        <w:rPr>
+          <w:b w:val="0"/>
+          <w:bCs w:val="0"/>
+          <w:sz w:val="28"/>
+          <w:szCs w:val="28"/>
+          <w:highlight w:val="none"/>
+        </w:rPr>
+      </w:r>
+    </w:p>
+    <w:p>
+      <w:pPr>
+        <w:pStyle w:val="904"/>
+        <w:numPr>
+          <w:ilvl w:val="0"/>
+          <w:numId w:val="7"/>
+        </w:numPr>
+        <w:pBdr/>
+        <w:spacing/>
+        <w:ind/>
+        <w:jc w:val="both"/>
+        <w:rPr>
+          <w:b w:val="0"/>
+          <w:bCs w:val="0"/>
+          <w:sz w:val="48"/>
+          <w:szCs w:val="48"/>
+        </w:rPr>
+      </w:pPr>
+      <w:r>
+        <w:rPr>
+          <w:b w:val="0"/>
+          <w:bCs w:val="0"/>
+          <w:sz w:val="28"/>
+          <w:szCs w:val="28"/>
+          <w:highlight w:val="none"/>
+        </w:rPr>
+      </w:r>
+      <w:r>
+        <w:rPr>
+          <w:b/>
+          <w:bCs/>
+          <w:sz w:val="28"/>
+          <w:szCs w:val="28"/>
+          <w:highlight w:val="none"/>
+        </w:rPr>
+        <w:t xml:space="preserve">Signals: </w:t>
+      </w:r>
+      <w:r>
+        <w:rPr>
+          <w:b/>
+          <w:bCs/>
+          <w:sz w:val="28"/>
+          <w:szCs w:val="28"/>
+          <w:highlight w:val="none"/>
+        </w:rPr>
+        <w:t xml:space="preserve"> </w:t>
+      </w:r>
+      <w:r>
+        <w:rPr>
+          <w:b w:val="0"/>
+          <w:bCs w:val="0"/>
+          <w:sz w:val="28"/>
+          <w:szCs w:val="28"/>
+          <w:highlight w:val="none"/>
+        </w:rPr>
+        <w:t xml:space="preserve">Na criaç</w:t>
+      </w:r>
+      <w:r>
+        <w:rPr>
+          <w:b w:val="0"/>
+          <w:bCs w:val="0"/>
+          <w:sz w:val="28"/>
+          <w:szCs w:val="28"/>
+          <w:highlight w:val="none"/>
+        </w:rPr>
+        <w:t xml:space="preserve">ão de modelos de dados, existe um processamento antes de voc</w:t>
+      </w:r>
+      <w:r>
+        <w:rPr>
+          <w:b w:val="0"/>
+          <w:bCs w:val="0"/>
+          <w:sz w:val="28"/>
+          <w:szCs w:val="28"/>
+          <w:highlight w:val="none"/>
+        </w:rPr>
+        <w:t xml:space="preserve">ê salvar o modelo e depois, ou seja, podemos aplicar um sinal </w:t>
+      </w:r>
+      <w:r>
+        <w:rPr>
+          <w:b w:val="0"/>
+          <w:bCs w:val="0"/>
+          <w:sz w:val="28"/>
+          <w:szCs w:val="28"/>
+          <w:highlight w:val="none"/>
+        </w:rPr>
+        <w:t xml:space="preserve">e falar:</w:t>
+      </w:r>
+      <w:r>
+        <w:rPr>
+          <w:b w:val="0"/>
+          <w:bCs w:val="0"/>
+          <w:sz w:val="48"/>
+          <w:szCs w:val="48"/>
+        </w:rPr>
+      </w:r>
+    </w:p>
+    <w:p>
+      <w:pPr>
+        <w:pStyle w:val="904"/>
+        <w:numPr>
+          <w:ilvl w:val="1"/>
+          <w:numId w:val="7"/>
+        </w:numPr>
+        <w:pBdr/>
+        <w:spacing/>
+        <w:ind/>
+        <w:jc w:val="both"/>
+        <w:rPr>
+          <w:b w:val="0"/>
+          <w:bCs w:val="0"/>
+          <w:sz w:val="48"/>
+          <w:szCs w:val="48"/>
+        </w:rPr>
+      </w:pPr>
+      <w:r>
+        <w:rPr>
+          <w:b w:val="0"/>
+          <w:bCs w:val="0"/>
+          <w:sz w:val="28"/>
+          <w:szCs w:val="28"/>
+          <w:highlight w:val="none"/>
+        </w:rPr>
+      </w:r>
+      <w:r>
+        <w:rPr>
+          <w:b w:val="0"/>
+          <w:bCs w:val="0"/>
+          <w:sz w:val="28"/>
+          <w:szCs w:val="28"/>
+          <w:highlight w:val="none"/>
+        </w:rPr>
+        <w:t xml:space="preserve">Faça alguma coisa antes de inserir esses dados no banco;</w:t>
+      </w:r>
+      <w:r>
+        <w:rPr>
+          <w:b w:val="0"/>
+          <w:bCs w:val="0"/>
+          <w:sz w:val="48"/>
+          <w:szCs w:val="48"/>
+        </w:rPr>
+      </w:r>
+    </w:p>
+    <w:p>
+      <w:pPr>
+        <w:pStyle w:val="904"/>
+        <w:numPr>
+          <w:ilvl w:val="1"/>
+          <w:numId w:val="7"/>
+        </w:numPr>
+        <w:pBdr/>
+        <w:spacing/>
+        <w:ind/>
+        <w:jc w:val="both"/>
+        <w:rPr>
+          <w:b w:val="0"/>
+          <w:bCs w:val="0"/>
+          <w:sz w:val="48"/>
+          <w:szCs w:val="48"/>
+        </w:rPr>
+      </w:pPr>
+      <w:r>
+        <w:rPr>
+          <w:b w:val="0"/>
+          <w:bCs w:val="0"/>
+          <w:sz w:val="28"/>
+          <w:szCs w:val="28"/>
+          <w:highlight w:val="none"/>
+        </w:rPr>
+        <w:t xml:space="preserve">Faça alguma coisa depois de inserir esses dados no banco;</w:t>
+      </w:r>
+      <w:r>
+        <w:rPr>
+          <w:b w:val="0"/>
+          <w:bCs w:val="0"/>
+          <w:sz w:val="28"/>
+          <w:szCs w:val="28"/>
+          <w:highlight w:val="none"/>
+        </w:rPr>
+      </w:r>
+      <w:r>
+        <w:rPr>
+          <w:b w:val="0"/>
+          <w:bCs w:val="0"/>
+          <w:sz w:val="28"/>
+          <w:szCs w:val="28"/>
+          <w:highlight w:val="none"/>
+        </w:rPr>
+      </w:r>
+    </w:p>
+    <w:p>
+      <w:pPr>
+        <w:pStyle w:val="904"/>
+        <w:numPr>
+          <w:ilvl w:val="0"/>
+          <w:numId w:val="7"/>
+        </w:numPr>
+        <w:pBdr/>
+        <w:spacing/>
+        <w:ind/>
+        <w:jc w:val="both"/>
+        <w:rPr>
+          <w:b w:val="0"/>
+          <w:bCs w:val="0"/>
+          <w:sz w:val="48"/>
+          <w:szCs w:val="48"/>
+        </w:rPr>
+      </w:pPr>
+      <w:r>
+        <w:rPr>
+          <w:b/>
+          <w:bCs/>
+          <w:sz w:val="28"/>
+          <w:szCs w:val="28"/>
+          <w:highlight w:val="none"/>
+        </w:rPr>
+        <w:t xml:space="preserve">SlugFly: </w:t>
+      </w:r>
+      <w:r>
+        <w:rPr>
+          <w:b w:val="0"/>
+          <w:bCs w:val="0"/>
+          <w:sz w:val="28"/>
+          <w:szCs w:val="28"/>
+          <w:highlight w:val="none"/>
+        </w:rPr>
+        <w:t xml:space="preserve">É usado para criar slugs. </w:t>
+      </w:r>
+      <w:r>
+        <w:rPr>
+          <w:b w:val="0"/>
+          <w:bCs w:val="0"/>
+          <w:sz w:val="28"/>
+          <w:szCs w:val="28"/>
+          <w:highlight w:val="none"/>
+        </w:rPr>
+        <w:t xml:space="preserve">Um slug </w:t>
+      </w:r>
+      <w:r>
+        <w:rPr>
+          <w:b w:val="0"/>
+          <w:bCs w:val="0"/>
+          <w:sz w:val="28"/>
+          <w:szCs w:val="28"/>
+          <w:highlight w:val="none"/>
+        </w:rPr>
+        <w:t xml:space="preserve">é b</w:t>
+      </w:r>
+      <w:r>
+        <w:rPr>
+          <w:b w:val="0"/>
+          <w:bCs w:val="0"/>
+          <w:sz w:val="28"/>
+          <w:szCs w:val="28"/>
+          <w:highlight w:val="none"/>
+        </w:rPr>
+        <w:t xml:space="preserve">asicamente criar, atrav</w:t>
+      </w:r>
+      <w:r>
+        <w:rPr>
+          <w:b w:val="0"/>
+          <w:bCs w:val="0"/>
+          <w:sz w:val="28"/>
+          <w:szCs w:val="28"/>
+          <w:highlight w:val="none"/>
+        </w:rPr>
+        <w:t xml:space="preserve">és de algum texto na p</w:t>
+      </w:r>
+      <w:r>
+        <w:rPr>
+          <w:b w:val="0"/>
+          <w:bCs w:val="0"/>
+          <w:sz w:val="28"/>
+          <w:szCs w:val="28"/>
+          <w:highlight w:val="none"/>
+        </w:rPr>
+        <w:t xml:space="preserve">ágina, um formato separado por traços que se adéqua a url.  </w:t>
+      </w:r>
+      <w:r>
+        <w:rPr>
+          <w:b w:val="0"/>
+          <w:bCs w:val="0"/>
           <w:sz w:val="28"/>
           <w:szCs w:val="28"/>
           <w:highlight w:val="none"/>
@@ -1856,7 +2226,9 @@
         <w:spacing/>
         <w:ind w:hanging="360" w:left="709"/>
       </w:pPr>
-      <w:rPr/>
+      <w:rPr>
+        <w:sz w:val="28"/>
+      </w:rPr>
       <w:start w:val="1"/>
       <w:suff w:val="tab"/>
     </w:lvl>
@@ -1870,7 +2242,9 @@
         <w:spacing/>
         <w:ind w:hanging="360" w:left="1440"/>
       </w:pPr>
-      <w:rPr/>
+      <w:rPr>
+        <w:sz w:val="28"/>
+      </w:rPr>
       <w:start w:val="1"/>
       <w:suff w:val="tab"/>
     </w:lvl>

</xml_diff>